<commit_message>
chinh sua cac diem mau thuan trong tai lieu
</commit_message>
<xml_diff>
--- a/docs/Thiet_ke_kien_truc_Storage.docx
+++ b/docs/Thiet_ke_kien_truc_Storage.docx
@@ -14,12 +14,156 @@
         <w:rPr>
           <w:color w:val="auto"/>
         </w:rPr>
-        <w:t xml:space="preserve">TÀI LIỆU THIẾT KẾ KIẾN TRÚC STORAGE </w:t>
+        <w:t>TÀI LI</w:t>
+      </w:r>
+      <w:r>
+        <w:rPr>
+          <w:color w:val="auto"/>
+        </w:rPr>
+        <w:t>Ệ</w:t>
+      </w:r>
+      <w:r>
+        <w:rPr>
+          <w:color w:val="auto"/>
+        </w:rPr>
+        <w:t>U THI</w:t>
+      </w:r>
+      <w:r>
+        <w:rPr>
+          <w:color w:val="auto"/>
+        </w:rPr>
+        <w:t>Ế</w:t>
+      </w:r>
+      <w:r>
+        <w:rPr>
+          <w:color w:val="auto"/>
+        </w:rPr>
+        <w:t>T K</w:t>
+      </w:r>
+      <w:r>
+        <w:rPr>
+          <w:color w:val="auto"/>
+        </w:rPr>
+        <w:t>Ế</w:t>
+      </w:r>
+      <w:r>
+        <w:rPr>
+          <w:color w:val="auto"/>
+        </w:rPr>
+        <w:t xml:space="preserve"> KI</w:t>
+      </w:r>
+      <w:r>
+        <w:rPr>
+          <w:color w:val="auto"/>
+        </w:rPr>
+        <w:t>Ế</w:t>
+      </w:r>
+      <w:r>
+        <w:rPr>
+          <w:color w:val="auto"/>
+        </w:rPr>
+        <w:t xml:space="preserve">N TRÚC STORAGE </w:t>
       </w:r>
     </w:p>
     <w:p>
       <w:r>
-        <w:t>Tài liệu kiến trúc xác định MinIO là Object Storage self-hosted, đồng thời client sẽ xin Presigned URL từ backend rồi upload trực tiếp lên S3/MinIO, tránh đi qua API Gateway. Tài liệu database cũng dùng các trường avatar_key, media_key, audio_key để tham chiếu đến object trên MinIO.</w:t>
+        <w:t>Tài li</w:t>
+      </w:r>
+      <w:r>
+        <w:t>ệ</w:t>
+      </w:r>
+      <w:r>
+        <w:t>u ki</w:t>
+      </w:r>
+      <w:r>
+        <w:t>ế</w:t>
+      </w:r>
+      <w:r>
+        <w:t>n trúc xác đ</w:t>
+      </w:r>
+      <w:r>
+        <w:t>ị</w:t>
+      </w:r>
+      <w:r>
+        <w:t>nh MinIO là Object Storage self-hosted, đ</w:t>
+      </w:r>
+      <w:r>
+        <w:t>ồ</w:t>
+      </w:r>
+      <w:r>
+        <w:t>ng th</w:t>
+      </w:r>
+      <w:r>
+        <w:t>ờ</w:t>
+      </w:r>
+      <w:r>
+        <w:t>i client s</w:t>
+      </w:r>
+      <w:r>
+        <w:t>ẽ</w:t>
+      </w:r>
+      <w:r>
+        <w:t xml:space="preserve"> xin Presigned URL t</w:t>
+      </w:r>
+      <w:r>
+        <w:t>ừ</w:t>
+      </w:r>
+      <w:r>
+        <w:t xml:space="preserve"> backend r</w:t>
+      </w:r>
+      <w:r>
+        <w:t>ồ</w:t>
+      </w:r>
+      <w:r>
+        <w:t>i upload tr</w:t>
+      </w:r>
+      <w:r>
+        <w:t>ự</w:t>
+      </w:r>
+      <w:r>
+        <w:t>c ti</w:t>
+      </w:r>
+      <w:r>
+        <w:t>ế</w:t>
+      </w:r>
+      <w:r>
+        <w:t>p lên S3/MinIO, tránh đi qua API Gateway. Tài li</w:t>
+      </w:r>
+      <w:r>
+        <w:t>ệ</w:t>
+      </w:r>
+      <w:r>
+        <w:t>u database cũng dùng các trư</w:t>
+      </w:r>
+      <w:r>
+        <w:t>ờ</w:t>
+      </w:r>
+      <w:r>
+        <w:t xml:space="preserve">ng </w:t>
+      </w:r>
+      <w:r>
+        <w:t>avatar_key, audio_key, image_key</w:t>
+      </w:r>
+      <w:r>
+        <w:t xml:space="preserve"> đ</w:t>
+      </w:r>
+      <w:r>
+        <w:t>ể</w:t>
+      </w:r>
+      <w:r>
+        <w:t xml:space="preserve"> tham chi</w:t>
+      </w:r>
+      <w:r>
+        <w:t>ế</w:t>
+      </w:r>
+      <w:r>
+        <w:t>u đ</w:t>
+      </w:r>
+      <w:r>
+        <w:t>ế</w:t>
+      </w:r>
+      <w:r>
+        <w:t>n object trên MinIO.</w:t>
       </w:r>
     </w:p>
     <w:p>
@@ -33,12 +177,72 @@
         <w:rPr>
           <w:color w:val="auto"/>
         </w:rPr>
-        <w:t>1. Kiến trúc Storage đề xuất</w:t>
+        <w:t>1. Ki</w:t>
+      </w:r>
+      <w:r>
+        <w:rPr>
+          <w:color w:val="auto"/>
+        </w:rPr>
+        <w:t>ế</w:t>
+      </w:r>
+      <w:r>
+        <w:rPr>
+          <w:color w:val="auto"/>
+        </w:rPr>
+        <w:t>n trúc Storage đ</w:t>
+      </w:r>
+      <w:r>
+        <w:rPr>
+          <w:color w:val="auto"/>
+        </w:rPr>
+        <w:t>ề</w:t>
+      </w:r>
+      <w:r>
+        <w:rPr>
+          <w:color w:val="auto"/>
+        </w:rPr>
+        <w:t xml:space="preserve"> xu</w:t>
+      </w:r>
+      <w:r>
+        <w:rPr>
+          <w:color w:val="auto"/>
+        </w:rPr>
+        <w:t>ấ</w:t>
+      </w:r>
+      <w:r>
+        <w:rPr>
+          <w:color w:val="auto"/>
+        </w:rPr>
+        <w:t>t</w:t>
       </w:r>
     </w:p>
     <w:p>
       <w:r>
-        <w:t>Điểm quan trọng của kiến trúc:</w:t>
+        <w:t>Đi</w:t>
+      </w:r>
+      <w:r>
+        <w:t>ể</w:t>
+      </w:r>
+      <w:r>
+        <w:t>m quan tr</w:t>
+      </w:r>
+      <w:r>
+        <w:t>ọ</w:t>
+      </w:r>
+      <w:r>
+        <w:t>ng c</w:t>
+      </w:r>
+      <w:r>
+        <w:t>ủ</w:t>
+      </w:r>
+      <w:r>
+        <w:t>a ki</w:t>
+      </w:r>
+      <w:r>
+        <w:t>ế</w:t>
+      </w:r>
+      <w:r>
+        <w:t>n trúc:</w:t>
       </w:r>
       <w:r>
         <w:br/>
@@ -46,11 +250,52 @@
       </w:r>
       <w:r>
         <w:br/>
-        <w:t>- Backend chỉ chịu trách nhiệm: Xác thực user, kiểm tra quyền, sinh object key, sinh Presigned URL, và lưu object_key vào PostgreSQL.</w:t>
+      </w:r>
+      <w:r>
+        <w:t>- Backend ch</w:t>
+      </w:r>
+      <w:r>
+        <w:t>ỉ</w:t>
+      </w:r>
+      <w:r>
+        <w:t xml:space="preserve"> ch</w:t>
+      </w:r>
+      <w:r>
+        <w:t>ị</w:t>
+      </w:r>
+      <w:r>
+        <w:t>u trách nhi</w:t>
+      </w:r>
+      <w:r>
+        <w:t>ệ</w:t>
+      </w:r>
+      <w:r>
+        <w:t>m: Xác th</w:t>
+      </w:r>
+      <w:r>
+        <w:t>ự</w:t>
+      </w:r>
+      <w:r>
+        <w:t>c user, ki</w:t>
+      </w:r>
+      <w:r>
+        <w:t>ể</w:t>
+      </w:r>
+      <w:r>
+        <w:t>m tra quy</w:t>
+      </w:r>
+      <w:r>
+        <w:t>ề</w:t>
+      </w:r>
+      <w:r>
+        <w:t>n, sinh object key, sinh Presigned URL, và lưu object_key vào PostgreSQL.</w:t>
       </w:r>
       <w:r>
         <w:br/>
-        <w:t>- Client upload/download trực tiếp với MinIO.</w:t>
+        <w:t xml:space="preserve">- </w:t>
+      </w:r>
+      <w:r>
+        <w:t>Client upload (Presigned) trực tiếp lên MinIO; download media công khai qua CDN.</w:t>
       </w:r>
     </w:p>
     <w:p>
@@ -64,12 +309,84 @@
         <w:rPr>
           <w:color w:val="auto"/>
         </w:rPr>
-        <w:t>2. Thiết kế và Tổ chức Bucket</w:t>
+        <w:t>2. Thi</w:t>
+      </w:r>
+      <w:r>
+        <w:rPr>
+          <w:color w:val="auto"/>
+        </w:rPr>
+        <w:t>ế</w:t>
+      </w:r>
+      <w:r>
+        <w:rPr>
+          <w:color w:val="auto"/>
+        </w:rPr>
+        <w:t>t k</w:t>
+      </w:r>
+      <w:r>
+        <w:rPr>
+          <w:color w:val="auto"/>
+        </w:rPr>
+        <w:t>ế</w:t>
+      </w:r>
+      <w:r>
+        <w:rPr>
+          <w:color w:val="auto"/>
+        </w:rPr>
+        <w:t xml:space="preserve"> và T</w:t>
+      </w:r>
+      <w:r>
+        <w:rPr>
+          <w:color w:val="auto"/>
+        </w:rPr>
+        <w:t>ổ</w:t>
+      </w:r>
+      <w:r>
+        <w:rPr>
+          <w:color w:val="auto"/>
+        </w:rPr>
+        <w:t xml:space="preserve"> ch</w:t>
+      </w:r>
+      <w:r>
+        <w:rPr>
+          <w:color w:val="auto"/>
+        </w:rPr>
+        <w:t>ứ</w:t>
+      </w:r>
+      <w:r>
+        <w:rPr>
+          <w:color w:val="auto"/>
+        </w:rPr>
+        <w:t>c Bucket</w:t>
       </w:r>
     </w:p>
     <w:p>
       <w:r>
-        <w:t>Không nên tạo một bucket cho mỗi file (tránh hàng nghìn bucket). Thay vào đó, thiết kế 3 bucket chính:</w:t>
+        <w:t>Không nên t</w:t>
+      </w:r>
+      <w:r>
+        <w:t>ạ</w:t>
+      </w:r>
+      <w:r>
+        <w:t>o m</w:t>
+      </w:r>
+      <w:r>
+        <w:t>ộ</w:t>
+      </w:r>
+      <w:r>
+        <w:t>t bucket cho m</w:t>
+      </w:r>
+      <w:r>
+        <w:t>ỗ</w:t>
+      </w:r>
+      <w:r>
+        <w:t xml:space="preserve">i file (tránh hàng nghìn bucket). Thay vào đó, </w:t>
+      </w:r>
+      <w:r>
+        <w:t>thiết kế 2 bucket chính</w:t>
+      </w:r>
+      <w:r>
+        <w:t>:</w:t>
       </w:r>
     </w:p>
     <w:tbl>
@@ -100,7 +417,13 @@
           </w:tcPr>
           <w:p>
             <w:r>
-              <w:t>Mục đích</w:t>
+              <w:t>M</w:t>
+            </w:r>
+            <w:r>
+              <w:t>ụ</w:t>
+            </w:r>
+            <w:r>
+              <w:t>c đích</w:t>
             </w:r>
           </w:p>
         </w:tc>
@@ -132,7 +455,37 @@
           </w:tcPr>
           <w:p>
             <w:r>
-              <w:t>Audio/image phục vụ học TOEIC (chứa audio/image câu hỏi, flashcard, vocabulary)</w:t>
+              <w:t>Audio/image ph</w:t>
+            </w:r>
+            <w:r>
+              <w:t>ụ</w:t>
+            </w:r>
+            <w:r>
+              <w:t>c v</w:t>
+            </w:r>
+            <w:r>
+              <w:t>ụ</w:t>
+            </w:r>
+            <w:r>
+              <w:t xml:space="preserve"> h</w:t>
+            </w:r>
+            <w:r>
+              <w:t>ọ</w:t>
+            </w:r>
+            <w:r>
+              <w:t>c TOEIC (ch</w:t>
+            </w:r>
+            <w:r>
+              <w:t>ứ</w:t>
+            </w:r>
+            <w:r>
+              <w:t>a audio/image câu h</w:t>
+            </w:r>
+            <w:r>
+              <w:t>ỏ</w:t>
+            </w:r>
+            <w:r>
+              <w:t>i, flashcard, vocabulary)</w:t>
             </w:r>
           </w:p>
         </w:tc>
@@ -142,7 +495,7 @@
           </w:tcPr>
           <w:p>
             <w:r>
-              <w:t>Không</w:t>
+              <w:t>Có (public-read + CDN)</w:t>
             </w:r>
           </w:p>
         </w:tc>
@@ -164,7 +517,13 @@
           </w:tcPr>
           <w:p>
             <w:r>
-              <w:t>Avatar, file riêng của user</w:t>
+              <w:t>Avatar, file riêng c</w:t>
+            </w:r>
+            <w:r>
+              <w:t>ủ</w:t>
+            </w:r>
+            <w:r>
+              <w:t>a user</w:t>
             </w:r>
           </w:p>
         </w:tc>
@@ -174,7 +533,7 @@
           </w:tcPr>
           <w:p>
             <w:r>
-              <w:t>Không</w:t>
+              <w:t>Không (private, presigned)</w:t>
             </w:r>
           </w:p>
         </w:tc>
@@ -191,12 +550,60 @@
         <w:rPr>
           <w:color w:val="auto"/>
         </w:rPr>
-        <w:t>3. Cấu trúc Object Key</w:t>
+        <w:t>3. C</w:t>
+      </w:r>
+      <w:r>
+        <w:rPr>
+          <w:color w:val="auto"/>
+        </w:rPr>
+        <w:t>ấ</w:t>
+      </w:r>
+      <w:r>
+        <w:rPr>
+          <w:color w:val="auto"/>
+        </w:rPr>
+        <w:t>u trúc Object Key</w:t>
       </w:r>
     </w:p>
     <w:p>
       <w:r>
-        <w:t>Object key cần được phân cấp rõ ràng để dễ quản lý.</w:t>
+        <w:t>Object key c</w:t>
+      </w:r>
+      <w:r>
+        <w:t>ầ</w:t>
+      </w:r>
+      <w:r>
+        <w:t>n đư</w:t>
+      </w:r>
+      <w:r>
+        <w:t>ợ</w:t>
+      </w:r>
+      <w:r>
+        <w:t>c phân c</w:t>
+      </w:r>
+      <w:r>
+        <w:t>ấ</w:t>
+      </w:r>
+      <w:r>
+        <w:t>p rõ ràng đ</w:t>
+      </w:r>
+      <w:r>
+        <w:t>ể</w:t>
+      </w:r>
+      <w:r>
+        <w:t xml:space="preserve"> d</w:t>
+      </w:r>
+      <w:r>
+        <w:t>ễ</w:t>
+      </w:r>
+      <w:r>
+        <w:t xml:space="preserve"> qu</w:t>
+      </w:r>
+      <w:r>
+        <w:t>ả</w:t>
+      </w:r>
+      <w:r>
+        <w:t>n lý.</w:t>
       </w:r>
     </w:p>
     <w:p>
@@ -218,15 +625,6 @@
         <w:t xml:space="preserve">Audio: </w:t>
       </w:r>
       <w:r>
-        <w:t>toeic-media</w:t>
-      </w:r>
-      <w:r>
-        <w:rPr>
-          <w:lang w:val="vi-VN"/>
-        </w:rPr>
-        <w:t>/</w:t>
-      </w:r>
-      <w:r>
         <w:t>questions/listening/part-1/{question_id}/audio.mp3</w:t>
       </w:r>
       <w:r>
@@ -234,35 +632,14 @@
         <w:t xml:space="preserve">Image: </w:t>
       </w:r>
       <w:r>
-        <w:t>toeic-</w:t>
-      </w:r>
-      <w:r>
-        <w:t>media</w:t>
-      </w:r>
-      <w:r>
-        <w:rPr>
-          <w:lang w:val="vi-VN"/>
-        </w:rPr>
-        <w:t>/</w:t>
-      </w:r>
-      <w:r>
-        <w:t>questions/reading/part-5/{question_id}/image.png</w:t>
+        <w:t>questions/listening/part-1/{question_id}/image.png</w:t>
       </w:r>
       <w:r>
         <w:br/>
         <w:t xml:space="preserve">Option: </w:t>
       </w:r>
       <w:r>
-        <w:t>toeic-media</w:t>
-      </w:r>
-      <w:r>
-        <w:rPr>
-          <w:lang w:val="vi-VN"/>
-        </w:rPr>
-        <w:t>/</w:t>
-      </w:r>
-      <w:r>
-        <w:t>questions/listening/part-1/{question_id}/options/A.png</w:t>
+        <w:t>questions/reading/part-7/{question_id}/options/A.png</w:t>
       </w:r>
     </w:p>
     <w:p>
@@ -287,13 +664,7 @@
         </w:rPr>
       </w:pPr>
       <w:r>
-        <w:t>Vocabulary: toeic-media</w:t>
-      </w:r>
-      <w:r>
-        <w:rPr>
-          <w:lang w:val="vi-VN"/>
-        </w:rPr>
-        <w:t>/</w:t>
+        <w:t xml:space="preserve">Vocabulary: </w:t>
       </w:r>
       <w:r>
         <w:t>learning/vocabulary/{vocabulary_id}/audio.mp3</w:t>
@@ -325,15 +696,6 @@
         <w:t xml:space="preserve">Avatar: </w:t>
       </w:r>
       <w:r>
-        <w:t>toeic-user</w:t>
-      </w:r>
-      <w:r>
-        <w:rPr>
-          <w:lang w:val="vi-VN"/>
-        </w:rPr>
-        <w:t>/</w:t>
-      </w:r>
-      <w:r>
         <w:t>avatars/{user_id}/avatar.jpg</w:t>
       </w:r>
     </w:p>
@@ -349,19 +711,115 @@
           <w:color w:val="auto"/>
         </w:rPr>
         <w:lastRenderedPageBreak/>
-        <w:t>4. Thiết kế Database (PostgreSQL &amp; MinIO)</w:t>
+        <w:t>4. Thi</w:t>
+      </w:r>
+      <w:r>
+        <w:rPr>
+          <w:color w:val="auto"/>
+        </w:rPr>
+        <w:t>ế</w:t>
+      </w:r>
+      <w:r>
+        <w:rPr>
+          <w:color w:val="auto"/>
+        </w:rPr>
+        <w:t>t k</w:t>
+      </w:r>
+      <w:r>
+        <w:rPr>
+          <w:color w:val="auto"/>
+        </w:rPr>
+        <w:t>ế</w:t>
+      </w:r>
+      <w:r>
+        <w:rPr>
+          <w:color w:val="auto"/>
+        </w:rPr>
+        <w:t xml:space="preserve"> Database (PostgreSQL &amp; MinIO)</w:t>
       </w:r>
     </w:p>
     <w:p>
       <w:r>
-        <w:t>Nguyên tắc quan trọng: MinIO lưu file, PostgreSQL lưu metadata và object key.</w:t>
+        <w:t>Nguyên t</w:t>
+      </w:r>
+      <w:r>
+        <w:t>ắ</w:t>
+      </w:r>
+      <w:r>
+        <w:t>c quan tr</w:t>
+      </w:r>
+      <w:r>
+        <w:t>ọ</w:t>
+      </w:r>
+      <w:r>
+        <w:t>ng: MinIO lưu file, PostgreSQL lưu metadata và object key.</w:t>
       </w:r>
       <w:r>
         <w:br/>
       </w:r>
       <w:r>
         <w:br/>
-        <w:t>Không nên lưu URL đầy đủ trong database (như http://minio:9000/toeic-media/...). Chỉ nên lưu key (ví dụ: media_key = questions/listening/part-1/{question_id}/audio.mp3) để thống nhất và linh hoạt khi đổi domain.</w:t>
+        <w:t>Không nên lưu URL đ</w:t>
+      </w:r>
+      <w:r>
+        <w:t>ầ</w:t>
+      </w:r>
+      <w:r>
+        <w:t>y đ</w:t>
+      </w:r>
+      <w:r>
+        <w:t>ủ</w:t>
+      </w:r>
+      <w:r>
+        <w:t xml:space="preserve"> trong database (như http://minio:9000/toeic-media/...). Ch</w:t>
+      </w:r>
+      <w:r>
+        <w:t>ỉ</w:t>
+      </w:r>
+      <w:r>
+        <w:t xml:space="preserve"> nên lưu key (ví d</w:t>
+      </w:r>
+      <w:r>
+        <w:t>ụ</w:t>
+      </w:r>
+      <w:r>
+        <w:t xml:space="preserve">: </w:t>
+      </w:r>
+      <w:r>
+        <w:t>audio_key = questions/listening/part-1/{question_id}/audio.mp3</w:t>
+      </w:r>
+      <w:r>
+        <w:t>) đ</w:t>
+      </w:r>
+      <w:r>
+        <w:t>ể</w:t>
+      </w:r>
+      <w:r>
+        <w:t xml:space="preserve"> th</w:t>
+      </w:r>
+      <w:r>
+        <w:t>ố</w:t>
+      </w:r>
+      <w:r>
+        <w:t>ng nh</w:t>
+      </w:r>
+      <w:r>
+        <w:t>ấ</w:t>
+      </w:r>
+      <w:r>
+        <w:t>t và linh ho</w:t>
+      </w:r>
+      <w:r>
+        <w:t>ạ</w:t>
+      </w:r>
+      <w:r>
+        <w:t>t khi đ</w:t>
+      </w:r>
+      <w:r>
+        <w:t>ổ</w:t>
+      </w:r>
+      <w:r>
+        <w:t>i domain.</w:t>
       </w:r>
     </w:p>
     <w:p>
@@ -375,7 +833,19 @@
         <w:rPr>
           <w:color w:val="auto"/>
         </w:rPr>
-        <w:t>5. Luồng Upload và Download</w:t>
+        <w:t>5. Lu</w:t>
+      </w:r>
+      <w:r>
+        <w:rPr>
+          <w:color w:val="auto"/>
+        </w:rPr>
+        <w:t>ồ</w:t>
+      </w:r>
+      <w:r>
+        <w:rPr>
+          <w:color w:val="auto"/>
+        </w:rPr>
+        <w:t>ng Upload và Download</w:t>
       </w:r>
     </w:p>
     <w:p>
@@ -389,24 +859,95 @@
         <w:rPr>
           <w:color w:val="auto"/>
         </w:rPr>
-        <w:t>5.1. Luồng Upload</w:t>
+        <w:t>5.1. Lu</w:t>
+      </w:r>
+      <w:r>
+        <w:rPr>
+          <w:color w:val="auto"/>
+        </w:rPr>
+        <w:t>ồ</w:t>
+      </w:r>
+      <w:r>
+        <w:rPr>
+          <w:color w:val="auto"/>
+        </w:rPr>
+        <w:t>ng Upload</w:t>
       </w:r>
     </w:p>
     <w:p>
       <w:r>
-        <w:t>1. Frontend gọi API POST /api/v1/questions/{id}/media/presign</w:t>
+        <w:t>1. Frontend g</w:t>
+      </w:r>
+      <w:r>
+        <w:t>ọ</w:t>
+      </w:r>
+      <w:r>
+        <w:t>i API POST /api/v1/questions/{id}/media/presign</w:t>
       </w:r>
       <w:r>
         <w:br/>
-        <w:t>2. Backend (Question Service) xác thực, sinh object key và Presigned URL trả về cho Frontend.</w:t>
+        <w:t>2. Backend (Question Service) xác th</w:t>
+      </w:r>
+      <w:r>
+        <w:t>ự</w:t>
+      </w:r>
+      <w:r>
+        <w:t>c, sinh object key và Presigned URL tr</w:t>
+      </w:r>
+      <w:r>
+        <w:t>ả</w:t>
+      </w:r>
+      <w:r>
+        <w:t xml:space="preserve"> v</w:t>
+      </w:r>
+      <w:r>
+        <w:t>ề</w:t>
+      </w:r>
+      <w:r>
+        <w:t xml:space="preserve"> cho Frontend.</w:t>
       </w:r>
       <w:r>
         <w:br/>
-        <w:t>3. Frontend PUT trực tiếp file lên MinIO bằng URL vừa nhận.</w:t>
+      </w:r>
+      <w:r>
+        <w:t>3. Frontend PUT tr</w:t>
+      </w:r>
+      <w:r>
+        <w:t>ự</w:t>
+      </w:r>
+      <w:r>
+        <w:t>c ti</w:t>
+      </w:r>
+      <w:r>
+        <w:t>ế</w:t>
+      </w:r>
+      <w:r>
+        <w:t>p file lên MinIO b</w:t>
+      </w:r>
+      <w:r>
+        <w:t>ằ</w:t>
+      </w:r>
+      <w:r>
+        <w:t>ng URL v</w:t>
+      </w:r>
+      <w:r>
+        <w:t>ừ</w:t>
+      </w:r>
+      <w:r>
+        <w:t>a nh</w:t>
+      </w:r>
+      <w:r>
+        <w:t>ậ</w:t>
+      </w:r>
+      <w:r>
+        <w:t>n.</w:t>
       </w:r>
       <w:r>
         <w:br/>
-        <w:t>4. Backend cập nhật media_key vào database.</w:t>
+        <w:t xml:space="preserve">4. </w:t>
+      </w:r>
+      <w:r>
+        <w:t>Backend cập nhật audio_key/image_key vào database.</w:t>
       </w:r>
     </w:p>
     <w:p>
@@ -420,20 +961,41 @@
         <w:rPr>
           <w:color w:val="auto"/>
         </w:rPr>
-        <w:t>5.2. Luồng Download/Play Audio</w:t>
+        <w:t>5.2. Lu</w:t>
+      </w:r>
+      <w:r>
+        <w:rPr>
+          <w:color w:val="auto"/>
+        </w:rPr>
+        <w:t>ồ</w:t>
+      </w:r>
+      <w:r>
+        <w:rPr>
+          <w:color w:val="auto"/>
+        </w:rPr>
+        <w:t>ng Download/Play Audio</w:t>
       </w:r>
     </w:p>
     <w:p>
       <w:r>
-        <w:t>1. Client GET thông tin câu hỏi (chứa media_key).</w:t>
+        <w:t xml:space="preserve">1. </w:t>
+      </w:r>
+      <w:r>
+        <w:t>Client GET thông tin câu hỏi (chứa audio_key/image_key).</w:t>
       </w:r>
       <w:r>
         <w:br/>
-        <w:t>2. Client gọi API lấy Presigned GET URL từ Backend.</w:t>
+        <w:t xml:space="preserve">2. </w:t>
+      </w:r>
+      <w:r>
+        <w:t>Backend trả về CDN URL công khai cho bucket toeic-media.</w:t>
       </w:r>
       <w:r>
         <w:br/>
-        <w:t>3. Client dùng URL đó để lấy file trực tiếp từ MinIO.</w:t>
+        <w:t xml:space="preserve">3. </w:t>
+      </w:r>
+      <w:r>
+        <w:t>Client phát/tải file trực tiếp từ CDN.</w:t>
       </w:r>
     </w:p>
     <w:p>
@@ -447,7 +1009,43 @@
         <w:rPr>
           <w:color w:val="auto"/>
         </w:rPr>
-        <w:t>6. Phân quyền và Bảo mật (MinIO)</w:t>
+        <w:t>6. Phân quy</w:t>
+      </w:r>
+      <w:r>
+        <w:rPr>
+          <w:color w:val="auto"/>
+        </w:rPr>
+        <w:t>ề</w:t>
+      </w:r>
+      <w:r>
+        <w:rPr>
+          <w:color w:val="auto"/>
+        </w:rPr>
+        <w:t>n và B</w:t>
+      </w:r>
+      <w:r>
+        <w:rPr>
+          <w:color w:val="auto"/>
+        </w:rPr>
+        <w:t>ả</w:t>
+      </w:r>
+      <w:r>
+        <w:rPr>
+          <w:color w:val="auto"/>
+        </w:rPr>
+        <w:t>o m</w:t>
+      </w:r>
+      <w:r>
+        <w:rPr>
+          <w:color w:val="auto"/>
+        </w:rPr>
+        <w:t>ậ</w:t>
+      </w:r>
+      <w:r>
+        <w:rPr>
+          <w:color w:val="auto"/>
+        </w:rPr>
+        <w:t>t (MinIO)</w:t>
       </w:r>
     </w:p>
     <w:p>
@@ -457,11 +1055,20 @@
         </w:rPr>
       </w:pPr>
       <w:r>
-        <w:t>- MinIO Public Access = OFF. Truy cập bắt buộc qua Presigned URL.</w:t>
+        <w:t xml:space="preserve">- </w:t>
+      </w:r>
+      <w:r>
+        <w:t>toeic-media: Public-read = ON (phục vụ qua CDN). toeic-user: Private (chỉ truy cập qua Presigned URL).</w:t>
       </w:r>
       <w:r>
         <w:br/>
-        <w:t xml:space="preserve">- Phân quyền theo Microservice: </w:t>
+        <w:t>- Phân quy</w:t>
+      </w:r>
+      <w:r>
+        <w:t>ề</w:t>
+      </w:r>
+      <w:r>
+        <w:t xml:space="preserve">n theo Microservice: </w:t>
       </w:r>
     </w:p>
     <w:p>
@@ -473,7 +1080,19 @@
         </w:numPr>
       </w:pPr>
       <w:r>
-        <w:t>Question Service chỉ được R/W/D trên toeic-media/questions/*</w:t>
+        <w:t>Question Service ch</w:t>
+      </w:r>
+      <w:r>
+        <w:t>ỉ</w:t>
+      </w:r>
+      <w:r>
+        <w:t xml:space="preserve"> đư</w:t>
+      </w:r>
+      <w:r>
+        <w:t>ợ</w:t>
+      </w:r>
+      <w:r>
+        <w:t>c R/W/D trên toeic-media/questions/*</w:t>
       </w:r>
     </w:p>
     <w:p>
@@ -497,7 +1116,7 @@
         </w:numPr>
       </w:pPr>
       <w:r>
-        <w:t>Auth Service trên toeic-user/avatars/*.</w:t>
+        <w:t>Auth Service trên toeic-user/avatars/*. Các service còn lại (Exam, Analytics, AI) không sở hữu prefix media và không truy cập trực tiếp bucket.</w:t>
       </w:r>
     </w:p>
     <w:p>
@@ -511,7 +1130,55 @@
         <w:rPr>
           <w:color w:val="auto"/>
         </w:rPr>
-        <w:t>7. Giới hạn File đề xuất</w:t>
+        <w:t>7. Gi</w:t>
+      </w:r>
+      <w:r>
+        <w:rPr>
+          <w:color w:val="auto"/>
+        </w:rPr>
+        <w:t>ớ</w:t>
+      </w:r>
+      <w:r>
+        <w:rPr>
+          <w:color w:val="auto"/>
+        </w:rPr>
+        <w:t>i h</w:t>
+      </w:r>
+      <w:r>
+        <w:rPr>
+          <w:color w:val="auto"/>
+        </w:rPr>
+        <w:t>ạ</w:t>
+      </w:r>
+      <w:r>
+        <w:rPr>
+          <w:color w:val="auto"/>
+        </w:rPr>
+        <w:t>n File đ</w:t>
+      </w:r>
+      <w:r>
+        <w:rPr>
+          <w:color w:val="auto"/>
+        </w:rPr>
+        <w:t>ề</w:t>
+      </w:r>
+      <w:r>
+        <w:rPr>
+          <w:color w:val="auto"/>
+        </w:rPr>
+        <w:t xml:space="preserve"> xu</w:t>
+      </w:r>
+      <w:r>
+        <w:rPr>
+          <w:color w:val="auto"/>
+        </w:rPr>
+        <w:t>ấ</w:t>
+      </w:r>
+      <w:r>
+        <w:rPr>
+          <w:color w:val="auto"/>
+        </w:rPr>
+        <w:t>t</w:t>
       </w:r>
     </w:p>
     <w:tbl>
@@ -533,7 +1200,13 @@
           </w:tcPr>
           <w:p>
             <w:r>
-              <w:t>Loại</w:t>
+              <w:t>Lo</w:t>
+            </w:r>
+            <w:r>
+              <w:t>ạ</w:t>
+            </w:r>
+            <w:r>
+              <w:t>i</w:t>
             </w:r>
           </w:p>
         </w:tc>
@@ -563,7 +1236,19 @@
           </w:tcPr>
           <w:p>
             <w:r>
-              <w:t>Giới hạn</w:t>
+              <w:t>Gi</w:t>
+            </w:r>
+            <w:r>
+              <w:t>ớ</w:t>
+            </w:r>
+            <w:r>
+              <w:t>i h</w:t>
+            </w:r>
+            <w:r>
+              <w:t>ạ</w:t>
+            </w:r>
+            <w:r>
+              <w:t>n</w:t>
             </w:r>
           </w:p>
         </w:tc>
@@ -605,10 +1290,7 @@
           </w:tcPr>
           <w:p>
             <w:r>
-              <w:t>2</w:t>
-            </w:r>
-            <w:r>
-              <w:t>0 MB</w:t>
+              <w:t>5 MB</w:t>
             </w:r>
           </w:p>
         </w:tc>
@@ -650,7 +1332,7 @@
           </w:tcPr>
           <w:p>
             <w:r>
-              <w:t>5 MB</w:t>
+              <w:t>2 MB</w:t>
             </w:r>
           </w:p>
         </w:tc>
@@ -692,7 +1374,7 @@
           </w:tcPr>
           <w:p>
             <w:r>
-              <w:t>5 MB</w:t>
+              <w:t>2 MB</w:t>
             </w:r>
           </w:p>
         </w:tc>
@@ -794,7 +1476,43 @@
           <w:color w:val="auto"/>
         </w:rPr>
         <w:lastRenderedPageBreak/>
-        <w:t>8. Triển khai Hạ tầng &amp; Code</w:t>
+        <w:t>8. Tri</w:t>
+      </w:r>
+      <w:r>
+        <w:rPr>
+          <w:color w:val="auto"/>
+        </w:rPr>
+        <w:t>ể</w:t>
+      </w:r>
+      <w:r>
+        <w:rPr>
+          <w:color w:val="auto"/>
+        </w:rPr>
+        <w:t>n khai H</w:t>
+      </w:r>
+      <w:r>
+        <w:rPr>
+          <w:color w:val="auto"/>
+        </w:rPr>
+        <w:t>ạ</w:t>
+      </w:r>
+      <w:r>
+        <w:rPr>
+          <w:color w:val="auto"/>
+        </w:rPr>
+        <w:t xml:space="preserve"> t</w:t>
+      </w:r>
+      <w:r>
+        <w:rPr>
+          <w:color w:val="auto"/>
+        </w:rPr>
+        <w:t>ầ</w:t>
+      </w:r>
+      <w:r>
+        <w:rPr>
+          <w:color w:val="auto"/>
+        </w:rPr>
+        <w:t>ng &amp; Code</w:t>
       </w:r>
     </w:p>
     <w:p>
@@ -844,6 +1562,11 @@
           <w:rFonts w:ascii="Courier New" w:hAnsi="Courier New"/>
         </w:rPr>
         <w:br/>
+      </w:r>
+      <w:r>
+        <w:rPr>
+          <w:rFonts w:ascii="Courier New" w:hAnsi="Courier New"/>
+        </w:rPr>
         <w:t xml:space="preserve">    ports:</w:t>
       </w:r>
       <w:r>
@@ -872,14 +1595,26 @@
           <w:rFonts w:ascii="Courier New" w:hAnsi="Courier New"/>
         </w:rPr>
         <w:br/>
-        <w:t xml:space="preserve">      MINIO_ROOT_USER: minioadmin</w:t>
+        <w:t xml:space="preserve">      </w:t>
+      </w:r>
+      <w:r>
+        <w:rPr>
+          <w:rFonts w:ascii="Courier New" w:hAnsi="Courier New"/>
+        </w:rPr>
+        <w:t>MINIO_ROOT_USER: ${MINIO_ROOT_USER}  # nạp từ .env/secret manager</w:t>
       </w:r>
       <w:r>
         <w:rPr>
           <w:rFonts w:ascii="Courier New" w:hAnsi="Courier New"/>
         </w:rPr>
         <w:br/>
-        <w:t xml:space="preserve">      MINIO_ROOT_PASSWORD: minioadmin123</w:t>
+        <w:t xml:space="preserve">      </w:t>
+      </w:r>
+      <w:r>
+        <w:rPr>
+          <w:rFonts w:ascii="Courier New" w:hAnsi="Courier New"/>
+        </w:rPr>
+        <w:t>MINIO_ROOT_PASSWORD: ${MINIO_ROOT_PASSWORD}  # nạp từ .env/secret manager</w:t>
       </w:r>
       <w:r>
         <w:rPr>
@@ -907,7 +1642,13 @@
           <w:rFonts w:ascii="Courier New" w:hAnsi="Courier New"/>
         </w:rPr>
         <w:br/>
-        <w:t xml:space="preserve">    restart: unless-stopped</w:t>
+        <w:t xml:space="preserve">    </w:t>
+      </w:r>
+      <w:r>
+        <w:rPr>
+          <w:rFonts w:ascii="Courier New" w:hAnsi="Courier New"/>
+        </w:rPr>
+        <w:t>restart: unless-stopped  # production: MinIO distributed mode + replication đảm bảo HA</w:t>
       </w:r>
       <w:r>
         <w:rPr>
@@ -940,7 +1681,73 @@
     </w:p>
     <w:p>
       <w:r>
-        <w:t>MinIO là infrastructure, không phải business microservice. Do đó, thiết kế một Storage Module chung, khai báo interface và inject vào các service cần thiết. Nếu sau này chuyển sang AWS S3 thì business logic không bị ảnh hưởng.</w:t>
+        <w:t>MinIO là infrastructure, không ph</w:t>
+      </w:r>
+      <w:r>
+        <w:t>ả</w:t>
+      </w:r>
+      <w:r>
+        <w:t>i business microservice. Do đó, thi</w:t>
+      </w:r>
+      <w:r>
+        <w:t>ế</w:t>
+      </w:r>
+      <w:r>
+        <w:t>t k</w:t>
+      </w:r>
+      <w:r>
+        <w:t>ế</w:t>
+      </w:r>
+      <w:r>
+        <w:t xml:space="preserve"> m</w:t>
+      </w:r>
+      <w:r>
+        <w:t>ộ</w:t>
+      </w:r>
+      <w:r>
+        <w:t>t Storage Module chung, khai báo interface và inject vào các service c</w:t>
+      </w:r>
+      <w:r>
+        <w:t>ầ</w:t>
+      </w:r>
+      <w:r>
+        <w:t>n thi</w:t>
+      </w:r>
+      <w:r>
+        <w:t>ế</w:t>
+      </w:r>
+      <w:r>
+        <w:t>t. N</w:t>
+      </w:r>
+      <w:r>
+        <w:t>ế</w:t>
+      </w:r>
+      <w:r>
+        <w:t>u sau này chuy</w:t>
+      </w:r>
+      <w:r>
+        <w:t>ể</w:t>
+      </w:r>
+      <w:r>
+        <w:t>n sang AWS S3 thì business logic không b</w:t>
+      </w:r>
+      <w:r>
+        <w:t>ị</w:t>
+      </w:r>
+      <w:r>
+        <w:t xml:space="preserve"> </w:t>
+      </w:r>
+      <w:r>
+        <w:t>ả</w:t>
+      </w:r>
+      <w:r>
+        <w:t>nh hư</w:t>
+      </w:r>
+      <w:r>
+        <w:t>ở</w:t>
+      </w:r>
+      <w:r>
+        <w:t>ng.</w:t>
       </w:r>
     </w:p>
     <w:p>
@@ -954,12 +1761,60 @@
         <w:rPr>
           <w:color w:val="auto"/>
         </w:rPr>
-        <w:t>9. Kiến trúc Storage Cuối cùng</w:t>
+        <w:t>9. Ki</w:t>
+      </w:r>
+      <w:r>
+        <w:rPr>
+          <w:color w:val="auto"/>
+        </w:rPr>
+        <w:t>ế</w:t>
+      </w:r>
+      <w:r>
+        <w:rPr>
+          <w:color w:val="auto"/>
+        </w:rPr>
+        <w:t>n trúc Storage Cu</w:t>
+      </w:r>
+      <w:r>
+        <w:rPr>
+          <w:color w:val="auto"/>
+        </w:rPr>
+        <w:t>ố</w:t>
+      </w:r>
+      <w:r>
+        <w:rPr>
+          <w:color w:val="auto"/>
+        </w:rPr>
+        <w:t>i cùng</w:t>
       </w:r>
     </w:p>
     <w:p>
       <w:r>
-        <w:t>Kết luận thiết kế:</w:t>
+        <w:t>K</w:t>
+      </w:r>
+      <w:r>
+        <w:t>ế</w:t>
+      </w:r>
+      <w:r>
+        <w:t>t lu</w:t>
+      </w:r>
+      <w:r>
+        <w:t>ậ</w:t>
+      </w:r>
+      <w:r>
+        <w:t>n thi</w:t>
+      </w:r>
+      <w:r>
+        <w:t>ế</w:t>
+      </w:r>
+      <w:r>
+        <w:t>t k</w:t>
+      </w:r>
+      <w:r>
+        <w:t>ế</w:t>
+      </w:r>
+      <w:r>
+        <w:t>:</w:t>
       </w:r>
       <w:r>
         <w:br/>
@@ -971,15 +1826,39 @@
       </w:r>
       <w:r>
         <w:br/>
-        <w:t>- Presigned URL = upload/download (Client &lt;-&gt; MinIO trực tiếp).</w:t>
+        <w:t xml:space="preserve">- </w:t>
+      </w:r>
+      <w:r>
+        <w:t>Presigned URL = upload; download/play qua CDN (media công khai) hoặc Presigned (file riêng tư).</w:t>
       </w:r>
       <w:r>
         <w:br/>
-        <w:t>- Private bucket = mặc định.</w:t>
+        <w:t xml:space="preserve">- </w:t>
+      </w:r>
+      <w:r>
+        <w:t>toeic-media = public-read qua CDN; toeic-user = private.</w:t>
       </w:r>
       <w:r>
         <w:br/>
-        <w:t>- Microservice sở hữu prefix/domain của mình.</w:t>
+        <w:t>- Microservice s</w:t>
+      </w:r>
+      <w:r>
+        <w:t>ở</w:t>
+      </w:r>
+      <w:r>
+        <w:t xml:space="preserve"> h</w:t>
+      </w:r>
+      <w:r>
+        <w:t>ữ</w:t>
+      </w:r>
+      <w:r>
+        <w:t>u prefix/domain c</w:t>
+      </w:r>
+      <w:r>
+        <w:t>ủ</w:t>
+      </w:r>
+      <w:r>
+        <w:t>a mình.</w:t>
       </w:r>
     </w:p>
     <w:sectPr>

</xml_diff>